<commit_message>
Add governed CMS publishing workflow
Extend the GEO plan and interactive mockup with human-approved Shopify and Sitecore publishing, Work IQ grounding, and managed FAQ maintenance.

Co-authored-by: Copilot <223556219+Copilot@users.noreply.github.com>

Copilot-Session: 8c520509-58e2-4af8-acd7-78f01ac942a9
</commit_message>
<xml_diff>
--- a/geo-agent-build-plan.docx
+++ b/geo-agent-build-plan.docx
@@ -16,7 +16,7 @@
         <w:spacing w:after="130"/>
       </w:pPr>
       <w:r>
-        <w:t xml:space="preserve">9 September 2026 | Proposed implementation | Planning only</w:t>
+        <w:t xml:space="preserve">10 September 2026 | Proposed implementation | Planning only</w:t>
       </w:r>
     </w:p>
     <w:p>
@@ -41,7 +41,7 @@
         <w:spacing w:after="130"/>
       </w:pPr>
       <w:r>
-        <w:t xml:space="preserve">The recommended first release is a local, authenticated live-service vertical slice: one public page, 5-10 approved queries, up to three Foundry evaluator profiles and an evidence-linked Markdown manifest plus recommendation files. A subsequent milestone proves one content-editor and review-agent hand-off. No CMS access or automatic publishing is included.</w:t>
+        <w:t xml:space="preserve">The recommended first release is a local, authenticated live-service vertical slice: one public page, 5-10 approved queries, up to three Foundry evaluator profiles and an evidence-linked Markdown manifest plus recommendation files. A subsequent milestone proves one content-editor and review-agent hand-off. The target architecture then adds human-approved publishing into the customer's existing CMS, with Shopify and Sitecore as illustrative connectors, followed by a governed maintenance loop for content such as FAQs. [S4]</w:t>
       </w:r>
     </w:p>
     <w:p>
@@ -653,7 +653,7 @@
                 <w:sz w:val="19"/>
                 <w:szCs w:val="19"/>
               </w:rPr>
-              <w:t xml:space="preserve">One agent-led conversation produces inspectable evidence and portable Markdown tasks.</w:t>
+              <w:t xml:space="preserve">One agent-led conversation produces inspectable evidence, reviewable content and a governed path to publication.</w:t>
             </w:r>
           </w:p>
         </w:tc>
@@ -685,7 +685,7 @@
                 <w:sz w:val="19"/>
                 <w:szCs w:val="19"/>
               </w:rPr>
-              <w:t xml:space="preserve">Keep human approval before publishing and distinguish agent roles.</w:t>
+              <w:t xml:space="preserve">Keep separate human approvals for query evaluation, content acceptance and CMS publishing; distinguish agent roles.</w:t>
             </w:r>
           </w:p>
         </w:tc>
@@ -959,7 +959,7 @@
                 <w:sz w:val="19"/>
                 <w:szCs w:val="19"/>
               </w:rPr>
-              <w:t xml:space="preserve">The prototype specifies a manifest and per-recommendation Markdown tasks.</w:t>
+              <w:t xml:space="preserve">The reference deck extends the flow from monitoring and content creation through human approval into Shopify or Sitecore, with Work IQ supplying brand guardrails and approved messaging.</w:t>
             </w:r>
           </w:p>
         </w:tc>
@@ -991,7 +991,7 @@
                 <w:sz w:val="19"/>
                 <w:szCs w:val="19"/>
               </w:rPr>
-              <w:t xml:space="preserve">Formalise schema, provenance, evidence links and consumer validation before dispatch. [S1]</w:t>
+              <w:t xml:space="preserve">Treat CMS targets as illustrative until connector contracts, permissions and rollback are verified. [S4]</w:t>
             </w:r>
           </w:p>
         </w:tc>
@@ -1423,7 +1423,7 @@
                 <w:sz w:val="19"/>
                 <w:szCs w:val="19"/>
               </w:rPr>
-              <w:t xml:space="preserve">Clarify URL, audience and goal; propose queries; explain evidence; request an export.</w:t>
+              <w:t xml:space="preserve">Clarify URL, audience and goal; propose queries; explain evidence; request drafts, approval and publication.</w:t>
             </w:r>
           </w:p>
         </w:tc>
@@ -1455,7 +1455,7 @@
                 <w:sz w:val="19"/>
                 <w:szCs w:val="19"/>
               </w:rPr>
-              <w:t xml:space="preserve">One conversational agent with narrow typed tools; no unrestricted browsing, shell or publishing tool.</w:t>
+              <w:t xml:space="preserve">One conversational agent with narrow typed tools; no unrestricted browsing or shell access. It may request a publish transition but cannot approve content or bypass server-side guards.</w:t>
             </w:r>
           </w:p>
         </w:tc>
@@ -2105,7 +2105,7 @@
                 <w:sz w:val="19"/>
                 <w:szCs w:val="19"/>
               </w:rPr>
-              <w:t xml:space="preserve">Run and artefact store</w:t>
+              <w:t xml:space="preserve">Work IQ grounding adapter</w:t>
             </w:r>
           </w:p>
         </w:tc>
@@ -2137,7 +2137,7 @@
                 <w:sz w:val="19"/>
                 <w:szCs w:val="19"/>
               </w:rPr>
-              <w:t xml:space="preserve">Persist approvals, job events, evidence, results and files.</w:t>
+              <w:t xml:space="preserve">Retrieve authorised brand guidance, approved messaging, workflow context and recent business changes relevant to the draft.</w:t>
             </w:r>
           </w:p>
         </w:tc>
@@ -2169,7 +2169,7 @@
                 <w:sz w:val="19"/>
                 <w:szCs w:val="19"/>
               </w:rPr>
-              <w:t xml:space="preserve">SQLite plus a restricted local artefact directory for the local milestone. Choose durable Azure storage before hosted deployment; do not rely on container-local disk.</w:t>
+              <w:t xml:space="preserve">Read-only, least-privilege retrieval with source IDs, freshness, permissions and retention recorded. Work IQ context can propose an FAQ update; it cannot approve or publish it. [S4]</w:t>
             </w:r>
           </w:p>
         </w:tc>
@@ -2207,6 +2207,108 @@
                 <w:sz w:val="19"/>
                 <w:szCs w:val="19"/>
               </w:rPr>
+              <w:t xml:space="preserve">Run and artefact store</w:t>
+            </w:r>
+          </w:p>
+        </w:tc>
+        <w:tc>
+          <w:tcPr>
+            <w:tcW w:type="dxa" w:w="3930"/>
+            <w:tcBorders>
+              <w:top w:val="single" w:color="D5DDE4" w:sz="4"/>
+              <w:left w:val="single" w:color="D5DDE4" w:sz="4"/>
+              <w:bottom w:val="single" w:color="D5DDE4" w:sz="4"/>
+              <w:right w:val="single" w:color="D5DDE4" w:sz="4"/>
+            </w:tcBorders>
+            <w:shd w:fill="FFFFFF" w:val="clear"/>
+            <w:tcMar>
+              <w:top w:type="dxa" w:w="100"/>
+              <w:left w:type="dxa" w:w="100"/>
+              <w:bottom w:type="dxa" w:w="100"/>
+              <w:right w:type="dxa" w:w="100"/>
+            </w:tcMar>
+          </w:tcPr>
+          <w:p>
+            <w:pPr>
+              <w:spacing w:after="60"/>
+            </w:pPr>
+            <w:r>
+              <w:rPr>
+                <w:b w:val="false"/>
+                <w:bCs w:val="false"/>
+                <w:sz w:val="19"/>
+                <w:szCs w:val="19"/>
+              </w:rPr>
+              <w:t xml:space="preserve">Persist approvals, job events, evidence, results and files.</w:t>
+            </w:r>
+          </w:p>
+        </w:tc>
+        <w:tc>
+          <w:tcPr>
+            <w:tcW w:type="dxa" w:w="3900"/>
+            <w:tcBorders>
+              <w:top w:val="single" w:color="D5DDE4" w:sz="4"/>
+              <w:left w:val="single" w:color="D5DDE4" w:sz="4"/>
+              <w:bottom w:val="single" w:color="D5DDE4" w:sz="4"/>
+              <w:right w:val="single" w:color="D5DDE4" w:sz="4"/>
+            </w:tcBorders>
+            <w:shd w:fill="FFFFFF" w:val="clear"/>
+            <w:tcMar>
+              <w:top w:type="dxa" w:w="100"/>
+              <w:left w:type="dxa" w:w="100"/>
+              <w:bottom w:type="dxa" w:w="100"/>
+              <w:right w:type="dxa" w:w="100"/>
+            </w:tcMar>
+          </w:tcPr>
+          <w:p>
+            <w:pPr>
+              <w:spacing w:after="60"/>
+            </w:pPr>
+            <w:r>
+              <w:rPr>
+                <w:b w:val="false"/>
+                <w:bCs w:val="false"/>
+                <w:sz w:val="19"/>
+                <w:szCs w:val="19"/>
+              </w:rPr>
+              <w:t xml:space="preserve">SQLite plus a restricted local artefact directory for the local milestone. Choose durable Azure storage before hosted deployment; do not rely on container-local disk.</w:t>
+            </w:r>
+          </w:p>
+        </w:tc>
+      </w:tr>
+      <w:tr>
+        <w:trPr>
+          <w:cantSplit/>
+          <w:tblHeader w:val="false"/>
+        </w:trPr>
+        <w:tc>
+          <w:tcPr>
+            <w:tcW w:type="dxa" w:w="1800"/>
+            <w:tcBorders>
+              <w:top w:val="single" w:color="D5DDE4" w:sz="4"/>
+              <w:left w:val="single" w:color="D5DDE4" w:sz="4"/>
+              <w:bottom w:val="single" w:color="D5DDE4" w:sz="4"/>
+              <w:right w:val="single" w:color="D5DDE4" w:sz="4"/>
+            </w:tcBorders>
+            <w:shd w:fill="FFFFFF" w:val="clear"/>
+            <w:tcMar>
+              <w:top w:type="dxa" w:w="100"/>
+              <w:left w:type="dxa" w:w="100"/>
+              <w:bottom w:type="dxa" w:w="100"/>
+              <w:right w:type="dxa" w:w="100"/>
+            </w:tcMar>
+          </w:tcPr>
+          <w:p>
+            <w:pPr>
+              <w:spacing w:after="60"/>
+            </w:pPr>
+            <w:r>
+              <w:rPr>
+                <w:b w:val="false"/>
+                <w:bCs w:val="false"/>
+                <w:sz w:val="19"/>
+                <w:szCs w:val="19"/>
+              </w:rPr>
               <w:t xml:space="preserve">Downstream proof</w:t>
             </w:r>
           </w:p>
@@ -2271,7 +2373,109 @@
                 <w:sz w:val="19"/>
                 <w:szCs w:val="19"/>
               </w:rPr>
-              <w:t xml:space="preserve">One content-editor role and one reviewer role; manual dispatch, isolated writable output directory, no CMS credentials.</w:t>
+              <w:t xml:space="preserve">One content-editor role and one reviewer role; manual dispatch and an isolated writable output directory.</w:t>
+            </w:r>
+          </w:p>
+        </w:tc>
+      </w:tr>
+      <w:tr>
+        <w:trPr>
+          <w:cantSplit/>
+          <w:tblHeader w:val="false"/>
+        </w:trPr>
+        <w:tc>
+          <w:tcPr>
+            <w:tcW w:type="dxa" w:w="1800"/>
+            <w:tcBorders>
+              <w:top w:val="single" w:color="D5DDE4" w:sz="4"/>
+              <w:left w:val="single" w:color="D5DDE4" w:sz="4"/>
+              <w:bottom w:val="single" w:color="D5DDE4" w:sz="4"/>
+              <w:right w:val="single" w:color="D5DDE4" w:sz="4"/>
+            </w:tcBorders>
+            <w:shd w:fill="FFFFFF" w:val="clear"/>
+            <w:tcMar>
+              <w:top w:type="dxa" w:w="100"/>
+              <w:left w:type="dxa" w:w="100"/>
+              <w:bottom w:type="dxa" w:w="100"/>
+              <w:right w:type="dxa" w:w="100"/>
+            </w:tcMar>
+          </w:tcPr>
+          <w:p>
+            <w:pPr>
+              <w:spacing w:after="60"/>
+            </w:pPr>
+            <w:r>
+              <w:rPr>
+                <w:b w:val="false"/>
+                <w:bCs w:val="false"/>
+                <w:sz w:val="19"/>
+                <w:szCs w:val="19"/>
+              </w:rPr>
+              <w:t xml:space="preserve">CMS approval and publishing service</w:t>
+            </w:r>
+          </w:p>
+        </w:tc>
+        <w:tc>
+          <w:tcPr>
+            <w:tcW w:type="dxa" w:w="3930"/>
+            <w:tcBorders>
+              <w:top w:val="single" w:color="D5DDE4" w:sz="4"/>
+              <w:left w:val="single" w:color="D5DDE4" w:sz="4"/>
+              <w:bottom w:val="single" w:color="D5DDE4" w:sz="4"/>
+              <w:right w:val="single" w:color="D5DDE4" w:sz="4"/>
+            </w:tcBorders>
+            <w:shd w:fill="FFFFFF" w:val="clear"/>
+            <w:tcMar>
+              <w:top w:type="dxa" w:w="100"/>
+              <w:left w:type="dxa" w:w="100"/>
+              <w:bottom w:type="dxa" w:w="100"/>
+              <w:right w:type="dxa" w:w="100"/>
+            </w:tcMar>
+          </w:tcPr>
+          <w:p>
+            <w:pPr>
+              <w:spacing w:after="60"/>
+            </w:pPr>
+            <w:r>
+              <w:rPr>
+                <w:b w:val="false"/>
+                <w:bCs w:val="false"/>
+                <w:sz w:val="19"/>
+                <w:szCs w:val="19"/>
+              </w:rPr>
+              <w:t xml:space="preserve">Create a CMS draft, bind approval to its exact revision, publish once approved and retain the receipt.</w:t>
+            </w:r>
+          </w:p>
+        </w:tc>
+        <w:tc>
+          <w:tcPr>
+            <w:tcW w:type="dxa" w:w="3900"/>
+            <w:tcBorders>
+              <w:top w:val="single" w:color="D5DDE4" w:sz="4"/>
+              <w:left w:val="single" w:color="D5DDE4" w:sz="4"/>
+              <w:bottom w:val="single" w:color="D5DDE4" w:sz="4"/>
+              <w:right w:val="single" w:color="D5DDE4" w:sz="4"/>
+            </w:tcBorders>
+            <w:shd w:fill="FFFFFF" w:val="clear"/>
+            <w:tcMar>
+              <w:top w:type="dxa" w:w="100"/>
+              <w:left w:type="dxa" w:w="100"/>
+              <w:bottom w:type="dxa" w:w="100"/>
+              <w:right w:type="dxa" w:w="100"/>
+            </w:tcMar>
+          </w:tcPr>
+          <w:p>
+            <w:pPr>
+              <w:spacing w:after="60"/>
+            </w:pPr>
+            <w:r>
+              <w:rPr>
+                <w:b w:val="false"/>
+                <w:bCs w:val="false"/>
+                <w:sz w:val="19"/>
+                <w:szCs w:val="19"/>
+              </w:rPr>
+              <w:t xml:space="preserve">Connector interface with Shopify and Sitecore as illustrative adapters. Separate credentials, scoped permissions, idempotency, preview, audit trail and rollback are mandatory. [S4]</w:t>
             </w:r>
           </w:p>
         </w:tc>
@@ -2287,7 +2491,7 @@
         <w:spacing w:after="130"/>
       </w:pPr>
       <w:r>
-        <w:t xml:space="preserve">Data flow: marketer &lt;-&gt; GEO agent &lt;-&gt; coordinator -&gt; Browse -&gt; query generation -&gt; explicit approval -&gt; Search and evaluator harness -&gt; presence matching -&gt; competitor comparison -&gt; recommendations -&gt; Markdown bundle -&gt; optional editor/reviewer proof -&gt; human review.</w:t>
+        <w:t xml:space="preserve">Data flow: monitor signals + marketer brief -&gt; GEO agent &lt;-&gt; coordinator -&gt; Browse -&gt; query generation -&gt; query approval -&gt; Search and evaluator harness -&gt; presence matching -&gt; competitor comparison -&gt; recommendations -&gt; Markdown bundle -&gt; editor/reviewer proof grounded by authorised Work IQ context -&gt; CMS draft -&gt; human content and publish approval -&gt; Shopify/Sitecore connector -&gt; live page -&gt; monitored retest.</w:t>
       </w:r>
     </w:p>
     <w:p>
@@ -2309,7 +2513,7 @@
         <w:spacing w:after="110"/>
       </w:pPr>
       <w:r>
-        <w:t xml:space="preserve">Phase A delivers the GEO agent through Markdown output. Phase B demonstrates a manually triggered downstream content draft and review. Full technical-editor execution is deferred; tasks may still describe technical recommendations.</w:t>
+        <w:t xml:space="preserve">Phase A delivers the GEO agent through Markdown output. Phase B demonstrates a manually triggered downstream content draft and review. Phase C adds a governed CMS connector path, and Phase D adds monitored maintenance proposals for approved content types such as FAQs. Full technical-editor execution is deferred; tasks may still describe technical recommendations.</w:t>
       </w:r>
     </w:p>
     <w:p>
@@ -2374,7 +2578,7 @@
         <w:spacing w:after="110"/>
       </w:pPr>
       <w:r>
-        <w:t xml:space="preserve">Exclude login-protected crawling, whole-site audits, automatic publishing, autonomous shell execution, schedules, fine-tuning, consumer-assistant scraping and unsupported ROI claims.</w:t>
+        <w:t xml:space="preserve">Exclude login-protected crawling, whole-site audits, unapproved or model-authorised publishing, autonomous shell execution, fine-tuning, consumer-assistant scraping and unsupported ROI claims. Scheduled maintenance may be added only after approval, connector and monitoring controls are proven.</w:t>
       </w:r>
     </w:p>
     <w:p>
@@ -2387,6 +2591,32 @@
         <w:spacing w:after="110"/>
       </w:pPr>
       <w:r>
+        <w:t xml:space="preserve">Shopify and Sitecore are illustrative CMS targets from the reference deck, not verified integrations. Confirm API scope, draft/review semantics, rate limits, identity model, audit fields and rollback behaviour before implementation. [S4]</w:t>
+      </w:r>
+    </w:p>
+    <w:p>
+      <w:pPr>
+        <w:pStyle w:val="ListParagraph"/>
+        <w:numPr>
+          <w:ilvl w:val="0"/>
+          <w:numId w:val="1"/>
+        </w:numPr>
+        <w:spacing w:after="110"/>
+      </w:pPr>
+      <w:r>
+        <w:t xml:space="preserve">"Self-maintaining" means continuously monitored and agent-maintained, with a human approving each publication. It never means autonomous unreviewed changes. Work IQ is an authorised grounding source for brand, policy and business context, not a blanket instruction channel.</w:t>
+      </w:r>
+    </w:p>
+    <w:p>
+      <w:pPr>
+        <w:pStyle w:val="ListParagraph"/>
+        <w:numPr>
+          <w:ilvl w:val="0"/>
+          <w:numId w:val="1"/>
+        </w:numPr>
+        <w:spacing w:after="110"/>
+      </w:pPr>
+      <w:r>
         <w:t xml:space="preserve">Preserve the offline HTML as a fixture/demo artefact. Explicit live, recorded and synthetic provenance travels with every run and evidence item. A failed live call must not silently substitute synthetic results.</w:t>
       </w:r>
     </w:p>
@@ -2470,15 +2700,15 @@
         <w:spacing w:after="130"/>
       </w:pPr>
       <w:r>
-        <w:t xml:space="preserve">States: draft -&gt; fetching -&gt; awaiting-query-approval -&gt; evaluating -&gt; comparing -&gt; recommendations-ready -&gt; exported. Failed, partial and cancelled states are explicit. Persist approval against a hash of page snapshot, approved queries, locale, profiles and retrieval settings. A changed input invalidates approval and starts a new run revision. Server guards check ownership, expected revision and idempotency keys; model text cannot count as approval.</w:t>
-      </w:r>
-    </w:p>
-    <w:p>
-      <w:pPr>
-        <w:spacing w:after="130"/>
-      </w:pPr>
-      <w:r>
-        <w:t xml:space="preserve">Tools: inspect_page(brief_id), propose_queries(run_id), start_evaluation(approved_run_id), get_run_status(run_id), get_evidence(run_id, evidence_id), generate_recommendations(run_id), export_tasks(run_id). Approval is a separate authenticated UI/API action, not an agent-authorised tool. Results refer to server-owned IDs, not caller-supplied filesystem paths.</w:t>
+        <w:t xml:space="preserve">States: draft -&gt; fetching -&gt; awaiting-query-approval -&gt; evaluating -&gt; comparing -&gt; recommendations-ready -&gt; exported -&gt; drafting -&gt; awaiting-content-approval -&gt; cms-draft-ready -&gt; awaiting-publish-approval -&gt; publishing -&gt; published -&gt; monitoring. Failed, partial, rejected, superseded, rollback-pending and cancelled states are explicit. Persist query approval against a hash of page snapshot, approved queries, locale, profiles and retrieval settings. Persist content and publish approvals separately against the exact draft hash, CMS target, destination and connector configuration. Any changed input invalidates the relevant approval and starts a new revision. Server guards check ownership, expected revision and idempotency keys; model text cannot count as approval.</w:t>
+      </w:r>
+    </w:p>
+    <w:p>
+      <w:pPr>
+        <w:spacing w:after="130"/>
+      </w:pPr>
+      <w:r>
+        <w:t xml:space="preserve">Tools: inspect_page(brief_id), propose_queries(run_id), start_evaluation(approved_run_id), get_run_status(run_id), get_evidence(run_id, evidence_id), generate_recommendations(run_id), export_tasks(run_id), create_cms_draft(approved_content_revision), publish_cms_revision(approved_publish_revision) and get_publication_receipt(publication_id). Approvals are separate authenticated UI/API actions, not agent-authorised tools. Results refer to server-owned IDs, not caller-supplied filesystem paths.</w:t>
       </w:r>
     </w:p>
     <w:p>
@@ -2633,7 +2863,7 @@
         <w:spacing w:after="130"/>
       </w:pPr>
       <w:r>
-        <w:t xml:space="preserve">Export one manifest and one .md per accepted recommendation. Each live artefact records schema_version, run_id, revision, task_id, created_at, source page URL and snapshot hash, provenance, retrieval mode, query/profile IDs, evidence IDs, priority, suggested role, depends_on, status=draft and requires_human_approval=true. Publish permission remains false. Keep compatibility with the demo's v1 fields or explicitly version a migration; do not silently replace fixture fields with live meanings.</w:t>
+        <w:t xml:space="preserve">Export one manifest and one .md per accepted recommendation. Each live artefact records schema_version, run_id, revision, task_id, created_at, source page URL and snapshot hash, provenance, retrieval mode, query/profile IDs, evidence IDs, priority, suggested role, depends_on, status=draft and requires_human_approval=true. Publish permission remains false in the task contract; a later CMS service derives authority only from a separate server-side approval record bound to an immutable content revision. Keep compatibility with the demo's v1 fields or explicitly version a migration; do not silently replace fixture fields with live meanings.</w:t>
       </w:r>
     </w:p>
     <w:p>
@@ -2690,7 +2920,7 @@
         <w:spacing w:after="130"/>
       </w:pPr>
       <w:r>
-        <w:t xml:space="preserve">Suggested API contracts: POST /briefs, POST /runs/{id}/query-approval, POST /runs/{id}/start, GET /runs/{id}, GET /runs/{id}/events, GET /runs/{id}/evidence/{evidence_id}, POST /runs/{id}/exports and GET /runs/{id}/artifacts/{artifact_id}. Exact routes are design proposals, not existing endpoints. Enforce authentication, run ownership and revision checks at every boundary; do not place provider credentials in browser code.</w:t>
+        <w:t xml:space="preserve">Suggested API contracts: POST /briefs, POST /runs/{id}/query-approval, POST /runs/{id}/start, GET /runs/{id}, GET /runs/{id}/events, GET /runs/{id}/evidence/{evidence_id}, POST /runs/{id}/exports, GET /runs/{id}/artifacts/{artifact_id}, POST /runs/{id}/content-approval, POST /runs/{id}/cms-drafts, POST /runs/{id}/publish-approval, POST /runs/{id}/publications and GET /runs/{id}/publications/{publication_id}. Exact routes are design proposals, not existing endpoints. Enforce authentication, run ownership, destination allowlists and revision checks at every boundary; do not place provider or CMS credentials in browser code.</w:t>
       </w:r>
     </w:p>
     <w:p>
@@ -2748,6 +2978,129 @@
       </w:pPr>
       <w:r>
         <w:t xml:space="preserve">Exit gate: one authorised consumer resolves real evidence, produces a reviewable draft and validation result, and cannot publish. The release checklist records quality findings, coverage, costs, access constraints and remaining risks. Cloud deployment is a separate approval, not implied by this plan.</w:t>
+      </w:r>
+    </w:p>
+    <w:p>
+      <w:pPr>
+        <w:pStyle w:val="Heading2"/>
+        <w:keepNext/>
+      </w:pPr>
+      <w:r>
+        <w:t xml:space="preserve">Phase 7: Human-approved CMS publishing</w:t>
+      </w:r>
+    </w:p>
+    <w:p>
+      <w:pPr>
+        <w:spacing w:after="130"/>
+      </w:pPr>
+      <w:r>
+        <w:t xml:space="preserve">Owner: CMS integration engineer, content owner and security reviewer. Dependency: phase 6 plus a customer-approved CMS sandbox.</w:t>
+      </w:r>
+    </w:p>
+    <w:p>
+      <w:pPr>
+        <w:spacing w:after="130"/>
+      </w:pPr>
+      <w:r>
+        <w:t xml:space="preserve">Define a connector-neutral CMSDraft and PublicationRequest contract. Start with one sandbox connector; Shopify and Sitecore are illustrative targets from the deck, not simultaneous MVP commitments. Map approved content only into allowlisted sites, locales, content types and fields. Read the current CMS revision before creating a draft, preserve customer workflow states and never overwrite a newer human edit.</w:t>
+      </w:r>
+    </w:p>
+    <w:p>
+      <w:pPr>
+        <w:spacing w:after="130"/>
+      </w:pPr>
+      <w:r>
+        <w:t xml:space="preserve">The content owner reviews a rendered preview and evidence map. A separate publish approver confirms the immutable CMS draft revision, destination and release note. The publish service verifies both approvals server-side, uses a dedicated least-privilege identity, supplies an idempotency key and records the CMS response, resulting URL/version and correlation ID. Query approval, task generation or chat text cannot authorise publication.</w:t>
+      </w:r>
+    </w:p>
+    <w:p>
+      <w:pPr>
+        <w:spacing w:after="130"/>
+      </w:pPr>
+      <w:r>
+        <w:t xml:space="preserve">Support dry-run, draft-only and publish modes. Production publish is disabled by default. Add explicit rejection, expiry, conflict and rollback paths; if the CMS cannot offer a safe rollback primitive, retain the previous content and provide a compensating-change workflow. Never silently retry an ambiguous publish result.</w:t>
+      </w:r>
+    </w:p>
+    <w:p>
+      <w:pPr>
+        <w:spacing w:after="130"/>
+      </w:pPr>
+      <w:r>
+        <w:t xml:space="preserve">Exit gate: an approved draft is published to one sandbox destination exactly once, an unapproved or stale revision is rejected, a concurrent CMS edit is preserved, and the audit log identifies who approved what, where and when. [S4]</w:t>
+      </w:r>
+    </w:p>
+    <w:p>
+      <w:pPr>
+        <w:pStyle w:val="Heading2"/>
+        <w:keepNext/>
+      </w:pPr>
+      <w:r>
+        <w:t xml:space="preserve">Phase 8: Governed content maintenance</w:t>
+      </w:r>
+    </w:p>
+    <w:p>
+      <w:pPr>
+        <w:spacing w:after="130"/>
+      </w:pPr>
+      <w:r>
+        <w:t xml:space="preserve">Owner: content operations, Work IQ integration engineer and evaluation engineer. Dependency: phases 3, 6 and 7.</w:t>
+      </w:r>
+    </w:p>
+    <w:p>
+      <w:pPr>
+        <w:spacing w:after="130"/>
+      </w:pPr>
+      <w:r>
+        <w:t xml:space="preserve">Create maintenance policies for explicitly enrolled content blocks, starting with FAQs. Signals may include new visibility gaps, stale source dates, changed authorised Work IQ guidance, approved messaging updates or changed product facts. Each signal produces a maintenance proposal with source provenance, a diff against the live CMS revision, affected claims, confidence, expiry and retest plan.</w:t>
+      </w:r>
+    </w:p>
+    <w:p>
+      <w:pPr>
+        <w:spacing w:after="130"/>
+      </w:pPr>
+      <w:r>
+        <w:t xml:space="preserve">Work IQ retrieval is read-only and permission-trimmed. Treat messages and documents as evidence that may be stale, conflicting or malicious; prefer designated authoritative sources, record freshness and require the reviewer to resolve conflicts. Do not infer approval from a document's presence or a user's role.</w:t>
+      </w:r>
+    </w:p>
+    <w:p>
+      <w:pPr>
+        <w:spacing w:after="130"/>
+      </w:pPr>
+      <w:r>
+        <w:t xml:space="preserve">Every maintenance revision follows the same draft -&gt; review -&gt; approval -&gt; publish path as net-new content. After publication, snapshot the new page and rerun matched held-out queries. Report observed change without attributing causation. Rate-limit proposals, deduplicate repeated signals and pause the loop after repeated failures, unresolved source conflicts or content-owner rejection.</w:t>
+      </w:r>
+    </w:p>
+    <w:p>
+      <w:pPr>
+        <w:spacing w:after="130"/>
+      </w:pPr>
+      <w:r>
+        <w:t xml:space="preserve">Exit gate: a controlled source change produces one deduplicated FAQ proposal, no live change occurs before approval, publication retains a full audit trail, and the post-publish evaluation is linked to the exact CMS revision.</w:t>
+      </w:r>
+    </w:p>
+    <w:p>
+      <w:pPr>
+        <w:pStyle w:val="Heading1"/>
+        <w:keepNext/>
+      </w:pPr>
+      <w:r>
+        <w:t xml:space="preserve">CMS Publishing and Continuous Maintenance</w:t>
+      </w:r>
+    </w:p>
+    <w:p>
+      <w:pPr>
+        <w:spacing w:after="130"/>
+      </w:pPr>
+      <w:r>
+        <w:t xml:space="preserve">The target operating model is **Monitor -&gt; Act -&gt; Approve -&gt; Publish -&gt; Retest**. The agent can prepare and submit a publication request, but only authenticated human decisions can release an immutable revision to a permitted CMS destination. Shopify PDPs/collection pages and Sitecore landing/campaign pages are examples from the reference deck; customer-specific content models and approval workflows remain authoritative. [S4]</w:t>
+      </w:r>
+    </w:p>
+    <w:p>
+      <w:pPr>
+        <w:spacing w:after="130"/>
+      </w:pPr>
+      <w:r>
+        <w:t xml:space="preserve">Continuously maintained FAQs are a governed use case, not an autonomous editing promise. Web IQ supplies external evidence, Work IQ supplies authorised organisational context and the CMS supplies the current live revision. The system proposes a bounded diff, a human approves it, the connector publishes it and the evaluator measures the resulting page. Each loop preserves provenance, approval, publication receipt and rollback information.</w:t>
       </w:r>
     </w:p>
     <w:p>
@@ -3857,6 +4210,274 @@
           </w:p>
         </w:tc>
       </w:tr>
+      <w:tr>
+        <w:trPr>
+          <w:cantSplit/>
+          <w:tblHeader w:val="false"/>
+        </w:trPr>
+        <w:tc>
+          <w:tcPr>
+            <w:tcW w:type="dxa" w:w="700"/>
+            <w:tcBorders>
+              <w:top w:val="single" w:color="D5DDE4" w:sz="4"/>
+              <w:left w:val="single" w:color="D5DDE4" w:sz="4"/>
+              <w:bottom w:val="single" w:color="D5DDE4" w:sz="4"/>
+              <w:right w:val="single" w:color="D5DDE4" w:sz="4"/>
+            </w:tcBorders>
+            <w:shd w:fill="FFFFFF" w:val="clear"/>
+            <w:tcMar>
+              <w:top w:type="dxa" w:w="100"/>
+              <w:left w:type="dxa" w:w="100"/>
+              <w:bottom w:type="dxa" w:w="100"/>
+              <w:right w:type="dxa" w:w="100"/>
+            </w:tcMar>
+          </w:tcPr>
+          <w:p>
+            <w:pPr>
+              <w:spacing w:after="60"/>
+            </w:pPr>
+            <w:r>
+              <w:rPr>
+                <w:b w:val="false"/>
+                <w:bCs w:val="false"/>
+                <w:sz w:val="19"/>
+                <w:szCs w:val="19"/>
+              </w:rPr>
+              <w:t xml:space="preserve">7</w:t>
+            </w:r>
+          </w:p>
+        </w:tc>
+        <w:tc>
+          <w:tcPr>
+            <w:tcW w:type="dxa" w:w="4250"/>
+            <w:tcBorders>
+              <w:top w:val="single" w:color="D5DDE4" w:sz="4"/>
+              <w:left w:val="single" w:color="D5DDE4" w:sz="4"/>
+              <w:bottom w:val="single" w:color="D5DDE4" w:sz="4"/>
+              <w:right w:val="single" w:color="D5DDE4" w:sz="4"/>
+            </w:tcBorders>
+            <w:shd w:fill="FFFFFF" w:val="clear"/>
+            <w:tcMar>
+              <w:top w:type="dxa" w:w="100"/>
+              <w:left w:type="dxa" w:w="100"/>
+              <w:bottom w:type="dxa" w:w="100"/>
+              <w:right w:type="dxa" w:w="100"/>
+            </w:tcMar>
+          </w:tcPr>
+          <w:p>
+            <w:pPr>
+              <w:spacing w:after="60"/>
+            </w:pPr>
+            <w:r>
+              <w:rPr>
+                <w:b w:val="false"/>
+                <w:bCs w:val="false"/>
+                <w:sz w:val="19"/>
+                <w:szCs w:val="19"/>
+              </w:rPr>
+              <w:t xml:space="preserve">CMS draft, approval and one sandbox publisher</w:t>
+            </w:r>
+          </w:p>
+        </w:tc>
+        <w:tc>
+          <w:tcPr>
+            <w:tcW w:type="dxa" w:w="2200"/>
+            <w:tcBorders>
+              <w:top w:val="single" w:color="D5DDE4" w:sz="4"/>
+              <w:left w:val="single" w:color="D5DDE4" w:sz="4"/>
+              <w:bottom w:val="single" w:color="D5DDE4" w:sz="4"/>
+              <w:right w:val="single" w:color="D5DDE4" w:sz="4"/>
+            </w:tcBorders>
+            <w:shd w:fill="FFFFFF" w:val="clear"/>
+            <w:tcMar>
+              <w:top w:type="dxa" w:w="100"/>
+              <w:left w:type="dxa" w:w="100"/>
+              <w:bottom w:type="dxa" w:w="100"/>
+              <w:right w:type="dxa" w:w="100"/>
+            </w:tcMar>
+          </w:tcPr>
+          <w:p>
+            <w:pPr>
+              <w:spacing w:after="60"/>
+            </w:pPr>
+            <w:r>
+              <w:rPr>
+                <w:b w:val="false"/>
+                <w:bCs w:val="false"/>
+                <w:sz w:val="19"/>
+                <w:szCs w:val="19"/>
+              </w:rPr>
+              <w:t xml:space="preserve">2-4 engineer-days</w:t>
+            </w:r>
+          </w:p>
+        </w:tc>
+        <w:tc>
+          <w:tcPr>
+            <w:tcW w:type="dxa" w:w="2480"/>
+            <w:tcBorders>
+              <w:top w:val="single" w:color="D5DDE4" w:sz="4"/>
+              <w:left w:val="single" w:color="D5DDE4" w:sz="4"/>
+              <w:bottom w:val="single" w:color="D5DDE4" w:sz="4"/>
+              <w:right w:val="single" w:color="D5DDE4" w:sz="4"/>
+            </w:tcBorders>
+            <w:shd w:fill="FFFFFF" w:val="clear"/>
+            <w:tcMar>
+              <w:top w:type="dxa" w:w="100"/>
+              <w:left w:type="dxa" w:w="100"/>
+              <w:bottom w:type="dxa" w:w="100"/>
+              <w:right w:type="dxa" w:w="100"/>
+            </w:tcMar>
+          </w:tcPr>
+          <w:p>
+            <w:pPr>
+              <w:spacing w:after="60"/>
+            </w:pPr>
+            <w:r>
+              <w:rPr>
+                <w:b w:val="false"/>
+                <w:bCs w:val="false"/>
+                <w:sz w:val="19"/>
+                <w:szCs w:val="19"/>
+              </w:rPr>
+              <w:t xml:space="preserve">6 and customer CMS access</w:t>
+            </w:r>
+          </w:p>
+        </w:tc>
+      </w:tr>
+      <w:tr>
+        <w:trPr>
+          <w:cantSplit/>
+          <w:tblHeader w:val="false"/>
+        </w:trPr>
+        <w:tc>
+          <w:tcPr>
+            <w:tcW w:type="dxa" w:w="700"/>
+            <w:tcBorders>
+              <w:top w:val="single" w:color="D5DDE4" w:sz="4"/>
+              <w:left w:val="single" w:color="D5DDE4" w:sz="4"/>
+              <w:bottom w:val="single" w:color="D5DDE4" w:sz="4"/>
+              <w:right w:val="single" w:color="D5DDE4" w:sz="4"/>
+            </w:tcBorders>
+            <w:shd w:fill="FFFFFF" w:val="clear"/>
+            <w:tcMar>
+              <w:top w:type="dxa" w:w="100"/>
+              <w:left w:type="dxa" w:w="100"/>
+              <w:bottom w:type="dxa" w:w="100"/>
+              <w:right w:type="dxa" w:w="100"/>
+            </w:tcMar>
+          </w:tcPr>
+          <w:p>
+            <w:pPr>
+              <w:spacing w:after="60"/>
+            </w:pPr>
+            <w:r>
+              <w:rPr>
+                <w:b w:val="false"/>
+                <w:bCs w:val="false"/>
+                <w:sz w:val="19"/>
+                <w:szCs w:val="19"/>
+              </w:rPr>
+              <w:t xml:space="preserve">8</w:t>
+            </w:r>
+          </w:p>
+        </w:tc>
+        <w:tc>
+          <w:tcPr>
+            <w:tcW w:type="dxa" w:w="4250"/>
+            <w:tcBorders>
+              <w:top w:val="single" w:color="D5DDE4" w:sz="4"/>
+              <w:left w:val="single" w:color="D5DDE4" w:sz="4"/>
+              <w:bottom w:val="single" w:color="D5DDE4" w:sz="4"/>
+              <w:right w:val="single" w:color="D5DDE4" w:sz="4"/>
+            </w:tcBorders>
+            <w:shd w:fill="FFFFFF" w:val="clear"/>
+            <w:tcMar>
+              <w:top w:type="dxa" w:w="100"/>
+              <w:left w:type="dxa" w:w="100"/>
+              <w:bottom w:type="dxa" w:w="100"/>
+              <w:right w:type="dxa" w:w="100"/>
+            </w:tcMar>
+          </w:tcPr>
+          <w:p>
+            <w:pPr>
+              <w:spacing w:after="60"/>
+            </w:pPr>
+            <w:r>
+              <w:rPr>
+                <w:b w:val="false"/>
+                <w:bCs w:val="false"/>
+                <w:sz w:val="19"/>
+                <w:szCs w:val="19"/>
+              </w:rPr>
+              <w:t xml:space="preserve">Work IQ-grounded FAQ maintenance loop</w:t>
+            </w:r>
+          </w:p>
+        </w:tc>
+        <w:tc>
+          <w:tcPr>
+            <w:tcW w:type="dxa" w:w="2200"/>
+            <w:tcBorders>
+              <w:top w:val="single" w:color="D5DDE4" w:sz="4"/>
+              <w:left w:val="single" w:color="D5DDE4" w:sz="4"/>
+              <w:bottom w:val="single" w:color="D5DDE4" w:sz="4"/>
+              <w:right w:val="single" w:color="D5DDE4" w:sz="4"/>
+            </w:tcBorders>
+            <w:shd w:fill="FFFFFF" w:val="clear"/>
+            <w:tcMar>
+              <w:top w:type="dxa" w:w="100"/>
+              <w:left w:type="dxa" w:w="100"/>
+              <w:bottom w:type="dxa" w:w="100"/>
+              <w:right w:type="dxa" w:w="100"/>
+            </w:tcMar>
+          </w:tcPr>
+          <w:p>
+            <w:pPr>
+              <w:spacing w:after="60"/>
+            </w:pPr>
+            <w:r>
+              <w:rPr>
+                <w:b w:val="false"/>
+                <w:bCs w:val="false"/>
+                <w:sz w:val="19"/>
+                <w:szCs w:val="19"/>
+              </w:rPr>
+              <w:t xml:space="preserve">1.5-3 engineer-days</w:t>
+            </w:r>
+          </w:p>
+        </w:tc>
+        <w:tc>
+          <w:tcPr>
+            <w:tcW w:type="dxa" w:w="2480"/>
+            <w:tcBorders>
+              <w:top w:val="single" w:color="D5DDE4" w:sz="4"/>
+              <w:left w:val="single" w:color="D5DDE4" w:sz="4"/>
+              <w:bottom w:val="single" w:color="D5DDE4" w:sz="4"/>
+              <w:right w:val="single" w:color="D5DDE4" w:sz="4"/>
+            </w:tcBorders>
+            <w:shd w:fill="FFFFFF" w:val="clear"/>
+            <w:tcMar>
+              <w:top w:type="dxa" w:w="100"/>
+              <w:left w:type="dxa" w:w="100"/>
+              <w:bottom w:type="dxa" w:w="100"/>
+              <w:right w:type="dxa" w:w="100"/>
+            </w:tcMar>
+          </w:tcPr>
+          <w:p>
+            <w:pPr>
+              <w:spacing w:after="60"/>
+            </w:pPr>
+            <w:r>
+              <w:rPr>
+                <w:b w:val="false"/>
+                <w:bCs w:val="false"/>
+                <w:sz w:val="19"/>
+                <w:szCs w:val="19"/>
+              </w:rPr>
+              <w:t xml:space="preserve">3, 6-7</w:t>
+            </w:r>
+          </w:p>
+        </w:tc>
+      </w:tr>
     </w:tbl>
     <w:p>
       <w:pPr>
@@ -3868,7 +4489,7 @@
         <w:spacing w:after="130"/>
       </w:pPr>
       <w:r>
-        <w:t xml:space="preserve">Core through Markdown: approximately 6-11.5 engineer-days. Including the downstream proof: approximately 7-13.5 engineer-days, excluding approvals and full production hardening. With a two-day hackathon, use one evaluator, five queries, a known accessible page and three bounded recommendations; prove the path before expanding profiles and UI scope. This smaller cut is not the complete three-profile product.</w:t>
+        <w:t xml:space="preserve">Core through Markdown: approximately 6-11.5 engineer-days. Including the downstream proof: approximately 7-13.5 engineer-days. Including one sandbox CMS connector: approximately 9-17.5 engineer-days. Including the controlled FAQ maintenance loop: approximately 10.5-20.5 engineer-days, excluding access approvals and full production hardening. With a two-day hackathon, use one evaluator, five queries, a known accessible page, three bounded recommendations and a simulated approval-to-CMS experience; prove the contract before connecting a customer CMS.</w:t>
       </w:r>
     </w:p>
     <w:p>
@@ -3911,7 +4532,7 @@
         <w:spacing w:after="110"/>
       </w:pPr>
       <w:r>
-        <w:t xml:space="preserve">Hard gates: no evaluation before valid approval; no cross-run/user access; no unsupported exact-page citation accepted as verified; all exported files schema-valid; no publishing capability; no secrets in browser or exported tasks. Passing tests is evidence for the tested cases, not a guarantee against all attacks.</w:t>
+        <w:t xml:space="preserve">Hard gates: no evaluation before valid query approval; no cross-run/user access; no unsupported exact-page citation accepted as verified; all exported files schema-valid; no CMS action before separately authenticated content and publish approvals; no stale draft publication; no secrets in browser or exported tasks. Passing tests is evidence for the tested cases, not a guarantee against all attacks.</w:t>
       </w:r>
     </w:p>
     <w:p>
@@ -4058,7 +4679,7 @@
         <w:spacing w:after="110"/>
       </w:pPr>
       <w:r>
-        <w:t xml:space="preserve">geo-agent/src/geo_agent/agents and api: GEO agent, downstream proof roles and authenticated endpoints.</w:t>
+        <w:t xml:space="preserve">geo-agent/src/geo_agent/grounding: permission-trimmed Work IQ context, authority/freshness policy and evidence normalization.</w:t>
       </w:r>
     </w:p>
     <w:p>
@@ -4071,7 +4692,7 @@
         <w:spacing w:after="110"/>
       </w:pPr>
       <w:r>
-        <w:t xml:space="preserve">geo-agent/tests: unit, adapter-contract, safety, fixture, integration and Markdown-consumer tests.</w:t>
+        <w:t xml:space="preserve">geo-agent/src/geo_agent/publishing: connector-neutral CMS contracts, approval verification, Shopify/Sitecore adapters, publication receipts and rollback handling.</w:t>
       </w:r>
     </w:p>
     <w:p>
@@ -4084,7 +4705,7 @@
         <w:spacing w:after="110"/>
       </w:pPr>
       <w:r>
-        <w:t xml:space="preserve">geo-agent/web: connected chat and evidence client, reusing the proposal's visual language.</w:t>
+        <w:t xml:space="preserve">geo-agent/src/geo_agent/agents and api: GEO agent, downstream proof roles and authenticated endpoints.</w:t>
       </w:r>
     </w:p>
     <w:p>
@@ -4097,7 +4718,7 @@
         <w:spacing w:after="110"/>
       </w:pPr>
       <w:r>
-        <w:t xml:space="preserve">geo-agent/.foundry: evaluation configuration/results as required by the selected Foundry workflow; no secrets or duplicated deployment state.</w:t>
+        <w:t xml:space="preserve">geo-agent/tests: unit, adapter-contract, safety, fixture, integration and Markdown-consumer tests.</w:t>
       </w:r>
     </w:p>
     <w:p>
@@ -4110,6 +4731,32 @@
         <w:spacing w:after="110"/>
       </w:pPr>
       <w:r>
+        <w:t xml:space="preserve">geo-agent/web: connected chat and evidence client, reusing the proposal's visual language.</w:t>
+      </w:r>
+    </w:p>
+    <w:p>
+      <w:pPr>
+        <w:pStyle w:val="ListParagraph"/>
+        <w:numPr>
+          <w:ilvl w:val="0"/>
+          <w:numId w:val="1"/>
+        </w:numPr>
+        <w:spacing w:after="110"/>
+      </w:pPr>
+      <w:r>
+        <w:t xml:space="preserve">geo-agent/.foundry: evaluation configuration/results as required by the selected Foundry workflow; no secrets or duplicated deployment state.</w:t>
+      </w:r>
+    </w:p>
+    <w:p>
+      <w:pPr>
+        <w:pStyle w:val="ListParagraph"/>
+        <w:numPr>
+          <w:ilvl w:val="0"/>
+          <w:numId w:val="1"/>
+        </w:numPr>
+        <w:spacing w:after="110"/>
+      </w:pPr>
+      <w:r>
         <w:t xml:space="preserve">Workspace-root .vscode: local agent debug configuration; deployment configuration and infrastructure added only after hosting choice.</w:t>
       </w:r>
     </w:p>
@@ -4159,15 +4806,31 @@
         <w:spacing w:after="130"/>
       </w:pPr>
       <w:r>
-        <w:t xml:space="preserve">4. Content owner: nominate one accessible page and desired buyer intent, then approve a small human-review dataset.</w:t>
-      </w:r>
-    </w:p>
-    <w:p>
-      <w:pPr>
-        <w:spacing w:after="130"/>
-      </w:pPr>
-      <w:r>
-        <w:t xml:space="preserve">5. Engineering: start phase 0 when implementation is authorised, preserve the offline proposal, and demonstrate one real citation trace before expanding profiles or downstream agents.</w:t>
+        <w:t xml:space="preserve">4. Content owner: nominate one accessible page and desired buyer intent, then approve a small human-review dataset and one maintenance-eligible FAQ block.</w:t>
+      </w:r>
+    </w:p>
+    <w:p>
+      <w:pPr>
+        <w:spacing w:after="130"/>
+      </w:pPr>
+      <w:r>
+        <w:t xml:space="preserve">5. CMS owner: choose either a Shopify or Sitecore sandbox, document its existing approval workflow, and define allowlisted destinations, rollback expectations and the authorised publisher identity.</w:t>
+      </w:r>
+    </w:p>
+    <w:p>
+      <w:pPr>
+        <w:spacing w:after="130"/>
+      </w:pPr>
+      <w:r>
+        <w:t xml:space="preserve">6. Work IQ owner: identify the authoritative brand, policy and approved-messaging sources that the agent may read; define freshness and conflict rules.</w:t>
+      </w:r>
+    </w:p>
+    <w:p>
+      <w:pPr>
+        <w:spacing w:after="130"/>
+      </w:pPr>
+      <w:r>
+        <w:t xml:space="preserve">7. Engineering: start phase 0 when implementation is authorised, preserve the offline proposal, and demonstrate one real citation trace before expanding profiles, downstream agents or CMS authority.</w:t>
       </w:r>
     </w:p>
     <w:p>
@@ -4186,7 +4849,7 @@
       <w:r>
         <w:t xml:space="preserve">[S1] Local requirements and prototype: </w:t>
       </w:r>
-      <w:hyperlink w:history="1" r:id="rIdn-l0h33j7ufnb_mlxmlof">
+      <w:hyperlink w:history="1" r:id="rId6zoniqwab01fivs1mgfs5">
         <w:r>
           <w:rPr>
             <w:rStyle w:val="Hyperlink"/>
@@ -4195,7 +4858,7 @@
         </w:r>
       </w:hyperlink>
       <w:r>
-        <w:t xml:space="preserve">, particularly workflow, architecture, technical approach, scope, risks and the embedded Markdown generator. Reviewed 9 September 2026. The file proves prototype behaviour and intended contracts, not live service capability.</w:t>
+        <w:t xml:space="preserve">, particularly workflow, architecture, technical approach, scope, risks and the embedded Markdown generator. Reviewed 10 September 2026. The file proves prototype behaviour and intended contracts, not live service capability.</w:t>
       </w:r>
     </w:p>
     <w:p>
@@ -4205,7 +4868,7 @@
       <w:r>
         <w:t xml:space="preserve">[S2] Microsoft Web IQ public service information: </w:t>
       </w:r>
-      <w:hyperlink w:history="1" r:id="rIdtd1gnv_ipiu4kjl5jk_ql">
+      <w:hyperlink w:history="1" r:id="rIdn_ep6jv_6zcmcz72mcaxu">
         <w:r>
           <w:rPr>
             <w:rStyle w:val="Hyperlink"/>
@@ -4224,7 +4887,7 @@
       <w:r>
         <w:t xml:space="preserve">[S3] Microsoft Foundry Agent Service overview: </w:t>
       </w:r>
-      <w:hyperlink w:history="1" r:id="rIdkhq9qlaxtb93h7arscd0i">
+      <w:hyperlink w:history="1" r:id="rIdbufablps83iodyhnzqals">
         <w:r>
           <w:rPr>
             <w:rStyle w:val="Hyperlink"/>
@@ -4241,11 +4904,30 @@
         <w:spacing w:after="130"/>
       </w:pPr>
       <w:r>
-        <w:t xml:space="preserve">No application code, Azure resources or HTML changes are part of this deliverable. This plan and its Word companion are the only product deliverables from this planning task.</w:t>
+        <w:t xml:space="preserve">[S4] GEO Content Agent reference deck: </w:t>
+      </w:r>
+      <w:hyperlink w:history="1" r:id="rId0pwr7nfwvg4csmvr3bk46">
+        <w:r>
+          <w:rPr>
+            <w:rStyle w:val="Hyperlink"/>
+          </w:rPr>
+          <w:t xml:space="preserve">https://microsofteur-my.sharepoint.com/:p:/g/personal/thomasjones_microsoft_com/IQBy3ediM0mmR5qK9s3sVAGbAQ0IEEhXMFk_xyUKYw4qYg0?e=R4NznB</w:t>
+        </w:r>
+      </w:hyperlink>
+      <w:r>
+        <w:t xml:space="preserve"> . Reviewed 10 September 2026. Supports the Monitor/Act/Publish vision, human approval boundary, Shopify and Sitecore examples, and Work IQ grounding role. The deck explicitly describes a concept and says no end-to-end reference implementation exists.</w:t>
+      </w:r>
+    </w:p>
+    <w:p>
+      <w:pPr>
+        <w:spacing w:after="130"/>
+      </w:pPr>
+      <w:r>
+        <w:t xml:space="preserve">No application code or Azure resources are created by this plan. The HTML remains a labelled offline simulation, including its CMS approval and publish interactions.</w:t>
       </w:r>
     </w:p>
     <w:sectPr>
-      <w:footerReference w:type="default" r:id="rId7"/>
+      <w:footerReference w:type="default" r:id="rId6"/>
       <w:pgSz w:w="11906" w:h="16838" w:orient="portrait"/>
       <w:pgMar w:top="1080" w:right="1138" w:bottom="1080" w:left="1138" w:header="708" w:footer="708" w:gutter="0"/>
       <w:pgNumType/>
@@ -4257,43 +4939,6 @@
 
 <file path=word/comments.xml><?xml version="1.0" encoding="utf-8"?>
 <w:comments xmlns:cx="http://schemas.microsoft.com/office/drawing/2014/chartex" xmlns:cx1="http://schemas.microsoft.com/office/drawing/2015/9/8/chartex" xmlns:cx2="http://schemas.microsoft.com/office/drawing/2015/10/21/chartex" xmlns:cx3="http://schemas.microsoft.com/office/drawing/2016/5/9/chartex" xmlns:cx4="http://schemas.microsoft.com/office/drawing/2016/5/10/chartex" xmlns:cx5="http://schemas.microsoft.com/office/drawing/2016/5/11/chartex" xmlns:cx6="http://schemas.microsoft.com/office/drawing/2016/5/12/chartex" xmlns:cx7="http://schemas.microsoft.com/office/drawing/2016/5/13/chartex" xmlns:cx8="http://schemas.microsoft.com/office/drawing/2016/5/14/chartex" xmlns:mc="http://schemas.openxmlformats.org/markup-compatibility/2006" xmlns:aink="http://schemas.microsoft.com/office/drawing/2016/ink" xmlns:am3d="http://schemas.microsoft.com/office/drawing/2017/model3d" xmlns:o="urn:schemas-microsoft-com:office:office" xmlns:r="http://schemas.openxmlformats.org/officeDocument/2006/relationships" xmlns:m="http://schemas.openxmlformats.org/officeDocument/2006/math" xmlns:v="urn:schemas-microsoft-com:vml" xmlns:wp14="http://schemas.microsoft.com/office/word/2010/wordprocessingDrawing" xmlns:wp="http://schemas.openxmlformats.org/drawingml/2006/wordprocessingDrawing" xmlns:w10="urn:schemas-microsoft-com:office:word" xmlns:w="http://schemas.openxmlformats.org/wordprocessingml/2006/main" xmlns:w14="http://schemas.microsoft.com/office/word/2010/wordml" xmlns:w15="http://schemas.microsoft.com/office/word/2012/wordml" xmlns:w16cex="http://schemas.microsoft.com/office/word/2018/wordml/cex" xmlns:w16cid="http://schemas.microsoft.com/office/word/2016/wordml/cid" xmlns:w16="http://schemas.microsoft.com/office/word/2018/wordml" xmlns:w16sdtdh="http://schemas.microsoft.com/office/word/2020/wordml/sdtdatahash" xmlns:w16se="http://schemas.microsoft.com/office/word/2015/wordml/symex" xmlns:wpg="http://schemas.microsoft.com/office/word/2010/wordprocessingGroup" xmlns:wpi="http://schemas.microsoft.com/office/word/2010/wordprocessingInk" xmlns:wne="http://schemas.microsoft.com/office/word/2006/wordml" xmlns:wps="http://schemas.microsoft.com/office/word/2010/wordprocessingShape"/>
-</file>
-
-<file path=word/endnotes.xml><?xml version="1.0" encoding="utf-8"?>
-<w:endnotes xmlns:wpc="http://schemas.microsoft.com/office/word/2010/wordprocessingCanvas" xmlns:mc="http://schemas.openxmlformats.org/markup-compatibility/2006" xmlns:o="urn:schemas-microsoft-com:office:office" xmlns:r="http://schemas.openxmlformats.org/officeDocument/2006/relationships" xmlns:m="http://schemas.openxmlformats.org/officeDocument/2006/math" xmlns:v="urn:schemas-microsoft-com:vml" xmlns:wp14="http://schemas.microsoft.com/office/word/2010/wordprocessingDrawing" xmlns:wp="http://schemas.openxmlformats.org/drawingml/2006/wordprocessingDrawing" xmlns:w10="urn:schemas-microsoft-com:office:word" xmlns:w="http://schemas.openxmlformats.org/wordprocessingml/2006/main" xmlns:w14="http://schemas.microsoft.com/office/word/2010/wordml" xmlns:w15="http://schemas.microsoft.com/office/word/2012/wordml" xmlns:wpg="http://schemas.microsoft.com/office/word/2010/wordprocessingGroup" xmlns:wpi="http://schemas.microsoft.com/office/word/2010/wordprocessingInk" xmlns:wne="http://schemas.microsoft.com/office/word/2006/wordml" xmlns:wps="http://schemas.microsoft.com/office/word/2010/wordprocessingShape" mc:Ignorable="w14 w15 wp14">
-  <w:endnote w:type="separator" w:id="-1">
-    <w:p>
-      <w:pPr>
-        <w:spacing w:after="0" w:line="240" w:lineRule="auto"/>
-      </w:pPr>
-      <w:r>
-        <w:rPr>
-          <w:rStyle w:val="EndnoteReference"/>
-        </w:rPr>
-        <w:endnoteRef/>
-      </w:r>
-      <w:r>
-        <w:separator/>
-      </w:r>
-    </w:p>
-  </w:endnote>
-  <w:endnote w:type="continuationSeparator" w:id="0">
-    <w:p>
-      <w:pPr>
-        <w:spacing w:after="0" w:line="240" w:lineRule="auto"/>
-      </w:pPr>
-      <w:r>
-        <w:rPr>
-          <w:rStyle w:val="EndnoteReference"/>
-        </w:rPr>
-        <w:endnoteRef/>
-      </w:r>
-      <w:r>
-        <w:continuationSeparator/>
-      </w:r>
-    </w:p>
-  </w:endnote>
-</w:endnotes>
 </file>
 
 <file path=word/footer1.xml><?xml version="1.0" encoding="utf-8"?>
@@ -4607,48 +5252,11 @@
       <w:szCs w:val="20"/>
     </w:rPr>
   </w:style>
-  <w:style w:type="character" w:styleId="EndnoteReference">
-    <w:name w:val="endnote reference"/>
-    <w:basedOn w:val="DefaultParagraphFont"/>
-    <w:uiPriority w:val="99"/>
-    <w:semiHidden/>
-    <w:unhideWhenUsed/>
-    <w:rPr>
-      <w:vertAlign w:val="superscript"/>
-    </w:rPr>
-  </w:style>
-  <w:style w:type="paragraph" w:styleId="EndnoteText">
-    <w:name w:val="endnote text"/>
-    <w:basedOn w:val="Normal"/>
-    <w:link w:val="EndnoteTextChar"/>
-    <w:uiPriority w:val="99"/>
-    <w:semiHidden/>
-    <w:unhideWhenUsed/>
-    <w:pPr>
-      <w:spacing w:after="0" w:line="240" w:lineRule="auto"/>
-    </w:pPr>
-    <w:rPr>
-      <w:sz w:val="20"/>
-      <w:szCs w:val="20"/>
-    </w:rPr>
-  </w:style>
-  <w:style w:type="character" w:styleId="EndnoteTextChar">
-    <w:name w:val="Endnote Text Char"/>
-    <w:basedOn w:val="DefaultParagraphFont"/>
-    <w:link w:val="EndnoteText"/>
-    <w:uiPriority w:val="99"/>
-    <w:semiHidden/>
-    <w:unhideWhenUsed/>
-    <w:rPr>
-      <w:sz w:val="20"/>
-      <w:szCs w:val="20"/>
-    </w:rPr>
-  </w:style>
   <w:style w:type="paragraph" w:styleId="Title">
     <w:name w:val="Title"/>
     <w:basedOn w:val="Normal"/>
     <w:pPr>
-      <w:spacing w:after="240" w:before="160"/>
+      <w:spacing w:before="160" w:after="240"/>
     </w:pPr>
     <w:rPr>
       <w:b/>
@@ -4665,7 +5273,7 @@
     <w:qFormat/>
     <w:pPr>
       <w:keepNext/>
-      <w:spacing w:after="150" w:before="300"/>
+      <w:spacing w:before="300" w:after="150"/>
       <w:outlineLvl w:val="0"/>
     </w:pPr>
     <w:rPr>
@@ -4683,7 +5291,7 @@
     <w:qFormat/>
     <w:pPr>
       <w:keepNext/>
-      <w:spacing w:after="120" w:before="240"/>
+      <w:spacing w:before="240" w:after="120"/>
       <w:outlineLvl w:val="1"/>
     </w:pPr>
     <w:rPr>

</xml_diff>